<commit_message>
Portwell is a pre-AI company
The fixture centred on an AI product, which answered the question the course
asks. Portwell now runs a customer help portal: a self-service site, live since
2019, where customers search the help centre before raising a ticket.

Nothing structural changed. A proposal is a suggestion, deflection is
self-service, and confidence is a match score. The routing rules, the article
eligibility problem and the seeded defects are untouched, because they were
never about the technology.

Both incidents improve. A superseded refund window reaching a customer is now a
knowledge failure rather than a model failure, and correct-in-general advice
reaching the wrong account is a process failure. Those are what a harness fixes.

Word and Excel files were rewritten at zip level, so the reporting pack's stale
cached value survived: it still reports 37.4 per cent attainment where its own
formula computes 36.8.
</commit_message>
<xml_diff>
--- a/data/packs/2026-07/ACCOUNT-1001-2026-07.docx
+++ b/data/packs/2026-07/ACCOUNT-1001-2026-07.docx
@@ -31,7 +31,7 @@
     </w:p>
     <w:p>
       <w:r>
-        <w:t>First response attainment for July was 37 per cent against the 30 minute Enterprise commitment, up from 8 per cent in June. The improvement follows the support assistant going live on the account at the start of the month.</w:t>
+        <w:t>First response attainment for July was 37 per cent against the 30 minute Enterprise commitment, up from 8 per cent in June. The improvement follows the help portal going live on the account at the start of the month.</w:t>
       </w:r>
     </w:p>
     <w:p>
@@ -62,7 +62,7 @@
         <w:pStyle w:val="Heading2"/>
       </w:pPr>
       <w:r>
-        <w:t>Deflection</w:t>
+        <w:t>Self-service</w:t>
       </w:r>
     </w:p>
     <w:p>

</xml_diff>